<commit_message>
really final commit before turn in
</commit_message>
<xml_diff>
--- a/פרוטוקול תקשורת.docx
+++ b/פרוטוקול תקשורת.docx
@@ -1464,7 +1464,7 @@
         <w:spacing w:line="360" w:lineRule="auto"/>
         <w:jc w:val="both"/>
         <w:rPr>
-          <w:rFonts w:asciiTheme="minorBidi" w:hAnsiTheme="minorBidi" w:hint="cs"/>
+          <w:rFonts w:asciiTheme="minorBidi" w:hAnsiTheme="minorBidi"/>
           <w:sz w:val="28"/>
           <w:szCs w:val="28"/>
           <w:rtl/>
@@ -1508,17 +1508,7 @@
           <w:rtl/>
           <w:lang w:val="en-US"/>
         </w:rPr>
-        <w:t xml:space="preserve"> </w:t>
-      </w:r>
-      <w:r>
-        <w:rPr>
-          <w:rFonts w:asciiTheme="minorBidi" w:hAnsiTheme="minorBidi" w:hint="cs"/>
-          <w:sz w:val="28"/>
-          <w:szCs w:val="28"/>
-          <w:rtl/>
-          <w:lang w:val="en-US"/>
-        </w:rPr>
-        <w:t xml:space="preserve">שדה של סוג ההתחברות </w:t>
+        <w:t xml:space="preserve"> שדה של סוג ההתחברות </w:t>
       </w:r>
       <w:r>
         <w:rPr>
@@ -1820,7 +1810,7 @@
         <w:spacing w:line="360" w:lineRule="auto"/>
         <w:jc w:val="both"/>
         <w:rPr>
-          <w:rFonts w:asciiTheme="minorBidi" w:hAnsiTheme="minorBidi" w:hint="cs"/>
+          <w:rFonts w:asciiTheme="minorBidi" w:hAnsiTheme="minorBidi"/>
           <w:sz w:val="28"/>
           <w:szCs w:val="28"/>
           <w:rtl/>
@@ -2086,27 +2076,7 @@
           <w:rtl/>
           <w:lang w:val="en-US"/>
         </w:rPr>
-        <w:t xml:space="preserve">שדה של שמות </w:t>
-      </w:r>
-      <w:r>
-        <w:rPr>
-          <w:rFonts w:asciiTheme="minorBidi" w:hAnsiTheme="minorBidi" w:hint="cs"/>
-          <w:sz w:val="28"/>
-          <w:szCs w:val="28"/>
-          <w:rtl/>
-          <w:lang w:val="en-US"/>
-        </w:rPr>
-        <w:t xml:space="preserve">עשרה </w:t>
-      </w:r>
-      <w:r>
-        <w:rPr>
-          <w:rFonts w:asciiTheme="minorBidi" w:hAnsiTheme="minorBidi" w:hint="cs"/>
-          <w:sz w:val="28"/>
-          <w:szCs w:val="28"/>
-          <w:rtl/>
-          <w:lang w:val="en-US"/>
-        </w:rPr>
-        <w:t>קלפים מופרדים על ידי פסיקים</w:t>
+        <w:t>שדה של שמות עשרה קלפים מופרדים על ידי פסיקים</w:t>
       </w:r>
       <w:r>
         <w:rPr>
@@ -2290,7 +2260,7 @@
         <w:spacing w:line="360" w:lineRule="auto"/>
         <w:jc w:val="both"/>
         <w:rPr>
-          <w:rFonts w:asciiTheme="minorBidi" w:hAnsiTheme="minorBidi" w:hint="cs"/>
+          <w:rFonts w:asciiTheme="minorBidi" w:hAnsiTheme="minorBidi"/>
           <w:sz w:val="28"/>
           <w:szCs w:val="28"/>
           <w:rtl/>
@@ -2465,27 +2435,7 @@
           <w:rtl/>
           <w:lang w:val="en-US"/>
         </w:rPr>
-        <w:t xml:space="preserve">שדה של שם הקלף </w:t>
-      </w:r>
-      <w:r>
-        <w:rPr>
-          <w:rFonts w:asciiTheme="minorBidi" w:hAnsiTheme="minorBidi" w:hint="cs"/>
-          <w:sz w:val="28"/>
-          <w:szCs w:val="28"/>
-          <w:rtl/>
-          <w:lang w:val="en-US"/>
-        </w:rPr>
-        <w:t>המחייה שאותו רוצים לשחק</w:t>
-      </w:r>
-      <w:r>
-        <w:rPr>
-          <w:rFonts w:asciiTheme="minorBidi" w:hAnsiTheme="minorBidi" w:hint="cs"/>
-          <w:sz w:val="28"/>
-          <w:szCs w:val="28"/>
-          <w:rtl/>
-          <w:lang w:val="en-US"/>
-        </w:rPr>
-        <w:t>.</w:t>
+        <w:t>שדה של שם הקלף המחייה שאותו רוצים לשחק.</w:t>
       </w:r>
     </w:p>
     <w:p>
@@ -2549,17 +2499,7 @@
           <w:rtl/>
           <w:lang w:val="en-US"/>
         </w:rPr>
-        <w:t>שדה של שם הקלף המחייה</w:t>
-      </w:r>
-      <w:r>
-        <w:rPr>
-          <w:rFonts w:asciiTheme="minorBidi" w:hAnsiTheme="minorBidi" w:hint="cs"/>
-          <w:sz w:val="28"/>
-          <w:szCs w:val="28"/>
-          <w:rtl/>
-          <w:lang w:val="en-US"/>
-        </w:rPr>
-        <w:t xml:space="preserve"> ושדה של שם הקלף שאותו רוצים להחיות.</w:t>
+        <w:t>שדה של שם הקלף המחייה ושדה של שם הקלף שאותו רוצים להחיות.</w:t>
       </w:r>
     </w:p>
     <w:p>
@@ -3477,27 +3417,7 @@
           <w:rtl/>
           <w:lang w:val="en-US"/>
         </w:rPr>
-        <w:t xml:space="preserve"> </w:t>
-      </w:r>
-      <w:r>
-        <w:rPr>
-          <w:rFonts w:asciiTheme="minorBidi" w:hAnsiTheme="minorBidi" w:hint="cs"/>
-          <w:sz w:val="28"/>
-          <w:szCs w:val="28"/>
-          <w:rtl/>
-          <w:lang w:val="en-US"/>
-        </w:rPr>
-        <w:t>לכולם</w:t>
-      </w:r>
-      <w:r>
-        <w:rPr>
-          <w:rFonts w:asciiTheme="minorBidi" w:hAnsiTheme="minorBidi" w:hint="cs"/>
-          <w:sz w:val="28"/>
-          <w:szCs w:val="28"/>
-          <w:rtl/>
-          <w:lang w:val="en-US"/>
-        </w:rPr>
-        <w:t xml:space="preserve"> ו-</w:t>
+        <w:t xml:space="preserve"> לכולם ו-</w:t>
       </w:r>
       <w:r>
         <w:rPr>
@@ -3516,27 +3436,7 @@
           <w:rtl/>
           <w:lang w:val="en-US"/>
         </w:rPr>
-        <w:t xml:space="preserve"> כדי לייצג את מצב הלוח </w:t>
-      </w:r>
-      <w:r>
-        <w:rPr>
-          <w:rFonts w:asciiTheme="minorBidi" w:hAnsiTheme="minorBidi" w:hint="cs"/>
-          <w:sz w:val="28"/>
-          <w:szCs w:val="28"/>
-          <w:rtl/>
-          <w:lang w:val="en-US"/>
-        </w:rPr>
-        <w:t>הנקי</w:t>
-      </w:r>
-      <w:r>
-        <w:rPr>
-          <w:rFonts w:asciiTheme="minorBidi" w:hAnsiTheme="minorBidi" w:hint="cs"/>
-          <w:sz w:val="28"/>
-          <w:szCs w:val="28"/>
-          <w:rtl/>
-          <w:lang w:val="en-US"/>
-        </w:rPr>
-        <w:t>.</w:t>
+        <w:t xml:space="preserve"> כדי לייצג את מצב הלוח הנקי.</w:t>
       </w:r>
     </w:p>
     <w:p>
@@ -4383,7 +4283,7 @@
         <w:spacing w:line="360" w:lineRule="auto"/>
         <w:jc w:val="both"/>
         <w:rPr>
-          <w:rFonts w:asciiTheme="minorBidi" w:hAnsiTheme="minorBidi" w:hint="cs"/>
+          <w:rFonts w:asciiTheme="minorBidi" w:hAnsiTheme="minorBidi"/>
           <w:sz w:val="28"/>
           <w:szCs w:val="28"/>
           <w:rtl/>
@@ -4423,30 +4323,185 @@
           <w:szCs w:val="28"/>
           <w:rtl/>
         </w:rPr>
-        <w:t xml:space="preserve"> מבנה הודעה לא תקין.</w:t>
-      </w:r>
-    </w:p>
-    <w:p>
-      <w:pPr>
-        <w:bidi/>
-        <w:spacing w:line="360" w:lineRule="auto"/>
-        <w:jc w:val="both"/>
-        <w:rPr>
-          <w:rFonts w:asciiTheme="minorBidi" w:hAnsiTheme="minorBidi" w:hint="cs"/>
-          <w:sz w:val="28"/>
-          <w:szCs w:val="28"/>
-          <w:rtl/>
-          <w:lang w:val="en-US"/>
-        </w:rPr>
-      </w:pPr>
-    </w:p>
-    <w:p>
-      <w:pPr>
-        <w:bidi/>
-        <w:spacing w:line="360" w:lineRule="auto"/>
-        <w:jc w:val="both"/>
-        <w:rPr>
-          <w:rFonts w:asciiTheme="minorBidi" w:hAnsiTheme="minorBidi" w:hint="cs"/>
+        <w:t xml:space="preserve"> </w:t>
+      </w:r>
+      <w:r>
+        <w:rPr>
+          <w:rFonts w:asciiTheme="minorBidi" w:hAnsiTheme="minorBidi" w:hint="cs"/>
+          <w:sz w:val="28"/>
+          <w:szCs w:val="28"/>
+          <w:rtl/>
+        </w:rPr>
+        <w:t xml:space="preserve">נשלחה בקשת </w:t>
+      </w:r>
+      <w:r>
+        <w:rPr>
+          <w:rFonts w:asciiTheme="minorBidi" w:hAnsiTheme="minorBidi"/>
+          <w:sz w:val="28"/>
+          <w:szCs w:val="28"/>
+          <w:lang w:val="en-US"/>
+        </w:rPr>
+        <w:t>PLAY</w:t>
+      </w:r>
+      <w:r>
+        <w:rPr>
+          <w:rFonts w:asciiTheme="minorBidi" w:hAnsiTheme="minorBidi" w:hint="cs"/>
+          <w:sz w:val="28"/>
+          <w:szCs w:val="28"/>
+          <w:rtl/>
+          <w:lang w:val="en-US"/>
+        </w:rPr>
+        <w:t xml:space="preserve"> בפורמט לא תקין או חסר</w:t>
+      </w:r>
+      <w:r>
+        <w:rPr>
+          <w:rFonts w:asciiTheme="minorBidi" w:hAnsiTheme="minorBidi" w:hint="cs"/>
+          <w:sz w:val="28"/>
+          <w:szCs w:val="28"/>
+          <w:rtl/>
+        </w:rPr>
+        <w:t>.</w:t>
+      </w:r>
+    </w:p>
+    <w:p>
+      <w:pPr>
+        <w:bidi/>
+        <w:spacing w:line="360" w:lineRule="auto"/>
+        <w:jc w:val="both"/>
+        <w:rPr>
+          <w:rFonts w:asciiTheme="minorBidi" w:hAnsiTheme="minorBidi"/>
+          <w:sz w:val="28"/>
+          <w:szCs w:val="28"/>
+          <w:rtl/>
+          <w:lang w:val="en-US"/>
+        </w:rPr>
+      </w:pPr>
+      <w:r>
+        <w:rPr>
+          <w:rFonts w:asciiTheme="minorBidi" w:hAnsiTheme="minorBidi"/>
+          <w:sz w:val="28"/>
+          <w:szCs w:val="28"/>
+        </w:rPr>
+        <w:t>Invalid EXEC_CHAIN format</w:t>
+      </w:r>
+      <w:r>
+        <w:rPr>
+          <w:rFonts w:asciiTheme="minorBidi" w:hAnsiTheme="minorBidi" w:hint="cs"/>
+          <w:sz w:val="28"/>
+          <w:szCs w:val="28"/>
+          <w:rtl/>
+        </w:rPr>
+        <w:t xml:space="preserve"> </w:t>
+      </w:r>
+      <w:r>
+        <w:rPr>
+          <w:rFonts w:asciiTheme="minorBidi" w:hAnsiTheme="minorBidi"/>
+          <w:sz w:val="28"/>
+          <w:szCs w:val="28"/>
+          <w:rtl/>
+        </w:rPr>
+        <w:t>–</w:t>
+      </w:r>
+      <w:r>
+        <w:rPr>
+          <w:rFonts w:asciiTheme="minorBidi" w:hAnsiTheme="minorBidi" w:hint="cs"/>
+          <w:sz w:val="28"/>
+          <w:szCs w:val="28"/>
+          <w:rtl/>
+        </w:rPr>
+        <w:t xml:space="preserve"> </w:t>
+      </w:r>
+      <w:r>
+        <w:rPr>
+          <w:rFonts w:asciiTheme="minorBidi" w:hAnsiTheme="minorBidi" w:hint="cs"/>
+          <w:sz w:val="28"/>
+          <w:szCs w:val="28"/>
+          <w:rtl/>
+        </w:rPr>
+        <w:t xml:space="preserve">נשלחה </w:t>
+      </w:r>
+      <w:r>
+        <w:rPr>
+          <w:rFonts w:asciiTheme="minorBidi" w:hAnsiTheme="minorBidi" w:hint="cs"/>
+          <w:sz w:val="28"/>
+          <w:szCs w:val="28"/>
+          <w:rtl/>
+        </w:rPr>
+        <w:t>בקשת</w:t>
+      </w:r>
+      <w:r>
+        <w:rPr>
+          <w:rFonts w:asciiTheme="minorBidi" w:hAnsiTheme="minorBidi" w:hint="cs"/>
+          <w:sz w:val="28"/>
+          <w:szCs w:val="28"/>
+          <w:rtl/>
+        </w:rPr>
+        <w:t xml:space="preserve"> </w:t>
+      </w:r>
+      <w:r>
+        <w:rPr>
+          <w:rFonts w:asciiTheme="minorBidi" w:hAnsiTheme="minorBidi"/>
+          <w:sz w:val="28"/>
+          <w:szCs w:val="28"/>
+          <w:lang w:val="en-US"/>
+        </w:rPr>
+        <w:t>EXEC_CHAIN</w:t>
+      </w:r>
+      <w:r>
+        <w:rPr>
+          <w:rFonts w:asciiTheme="minorBidi" w:hAnsiTheme="minorBidi" w:hint="cs"/>
+          <w:sz w:val="28"/>
+          <w:szCs w:val="28"/>
+          <w:rtl/>
+          <w:lang w:val="en-US"/>
+        </w:rPr>
+        <w:t xml:space="preserve"> בפורמט לא תקין או חסר</w:t>
+      </w:r>
+      <w:r>
+        <w:rPr>
+          <w:rFonts w:asciiTheme="minorBidi" w:hAnsiTheme="minorBidi" w:hint="cs"/>
+          <w:sz w:val="28"/>
+          <w:szCs w:val="28"/>
+          <w:rtl/>
+        </w:rPr>
+        <w:t>.</w:t>
+      </w:r>
+    </w:p>
+    <w:p>
+      <w:pPr>
+        <w:bidi/>
+        <w:spacing w:line="360" w:lineRule="auto"/>
+        <w:jc w:val="both"/>
+        <w:rPr>
+          <w:rFonts w:asciiTheme="minorBidi" w:hAnsiTheme="minorBidi"/>
+          <w:sz w:val="28"/>
+          <w:szCs w:val="28"/>
+          <w:rtl/>
+          <w:lang w:val="en-US"/>
+        </w:rPr>
+      </w:pPr>
+    </w:p>
+    <w:p>
+      <w:pPr>
+        <w:bidi/>
+        <w:spacing w:line="360" w:lineRule="auto"/>
+        <w:jc w:val="both"/>
+        <w:rPr>
+          <w:rFonts w:asciiTheme="minorBidi" w:hAnsiTheme="minorBidi"/>
+          <w:sz w:val="28"/>
+          <w:szCs w:val="28"/>
+          <w:rtl/>
+          <w:lang w:val="en-US"/>
+        </w:rPr>
+      </w:pPr>
+    </w:p>
+    <w:p>
+      <w:pPr>
+        <w:bidi/>
+        <w:spacing w:line="360" w:lineRule="auto"/>
+        <w:jc w:val="both"/>
+        <w:rPr>
+          <w:rFonts w:asciiTheme="minorBidi" w:hAnsiTheme="minorBidi"/>
           <w:sz w:val="28"/>
           <w:szCs w:val="28"/>
           <w:rtl/>
@@ -5068,6 +5123,7 @@
   <w:style w:type="character" w:default="1" w:styleId="DefaultParagraphFont">
     <w:name w:val="Default Paragraph Font"/>
     <w:uiPriority w:val="1"/>
+    <w:semiHidden/>
     <w:unhideWhenUsed/>
   </w:style>
   <w:style w:type="table" w:default="1" w:styleId="TableNormal">

</xml_diff>